<commit_message>
updates to project brief
</commit_message>
<xml_diff>
--- a/documentation/Stravaco-project-brief.docx
+++ b/documentation/Stravaco-project-brief.docx
@@ -30,95 +30,129 @@
           <w:sz w:val="40"/>
           <w:szCs w:val="40"/>
         </w:rPr>
-        <w:t xml:space="preserve"> </w:t>
-      </w:r>
-      <w:r>
+        <w:t xml:space="preserve"> Project Brief</w:t>
+      </w:r>
+    </w:p>
+    <w:p>
+      <w:pPr>
         <w:rPr>
           <w:b/>
           <w:bCs/>
-          <w:sz w:val="40"/>
-          <w:szCs w:val="40"/>
-        </w:rPr>
-        <w:t>Project Brief</w:t>
-      </w:r>
-    </w:p>
-    <w:p>
-      <w:pPr>
+        </w:rPr>
+      </w:pPr>
+      <w:r>
         <w:rPr>
           <w:b/>
           <w:bCs/>
         </w:rPr>
-      </w:pPr>
+        <w:t>Client Background:</w:t>
+      </w:r>
+    </w:p>
+    <w:p>
+      <w:pPr>
+        <w:spacing w:after="0"/>
+      </w:pPr>
+      <w:proofErr w:type="spellStart"/>
+      <w:r>
+        <w:t>Stravaco</w:t>
+      </w:r>
+      <w:proofErr w:type="spellEnd"/>
+      <w:r>
+        <w:t xml:space="preserve"> is</w:t>
+      </w:r>
+      <w:r>
+        <w:t xml:space="preserve"> a </w:t>
+      </w:r>
+      <w:r>
+        <w:t xml:space="preserve">NH based </w:t>
+      </w:r>
+      <w:r>
+        <w:t>tech startup</w:t>
+      </w:r>
+      <w:r>
+        <w:t xml:space="preserve"> </w:t>
+      </w:r>
+      <w:r>
+        <w:t xml:space="preserve">that recently launched a </w:t>
+      </w:r>
+      <w:r>
+        <w:t>fitness step</w:t>
+      </w:r>
+      <w:r>
+        <w:t xml:space="preserve"> tracking application.</w:t>
+      </w:r>
+    </w:p>
+    <w:p>
+      <w:pPr>
+        <w:spacing w:after="0"/>
+      </w:pPr>
+      <w:r>
+        <w:t>They've been using AWS for three months, initially setting up their infrastructure quickly to meet launch deadlines.</w:t>
+      </w:r>
+    </w:p>
+    <w:p>
+      <w:pPr>
+        <w:spacing w:after="0"/>
+      </w:pPr>
+      <w:r>
+        <w:t>N</w:t>
+      </w:r>
+      <w:r>
+        <w:t>ow that th</w:t>
+      </w:r>
+      <w:r>
+        <w:t>e</w:t>
+      </w:r>
+      <w:r>
+        <w:t xml:space="preserve"> product is live, they need to address their cloud security fundamentals.  The company has 1</w:t>
+      </w:r>
+      <w:r>
+        <w:t>2</w:t>
+      </w:r>
+      <w:r>
+        <w:t xml:space="preserve"> employees who all currently share the AWS root account credentials to access and manage their cloud resources.</w:t>
+      </w:r>
+    </w:p>
+    <w:p>
+      <w:pPr>
+        <w:spacing w:after="0"/>
+      </w:pPr>
+      <w:r>
+        <w:t xml:space="preserve">This practice started when they were moving quickly to launch, but now their </w:t>
+      </w:r>
+      <w:r>
+        <w:t xml:space="preserve">(new) </w:t>
+      </w:r>
+      <w:r>
+        <w:t>CTO recognizes the security risks this poses.</w:t>
+      </w:r>
+    </w:p>
+    <w:p>
+      <w:pPr>
+        <w:spacing w:after="0"/>
+      </w:pPr>
+    </w:p>
+    <w:p>
       <w:r>
         <w:rPr>
           <w:b/>
           <w:bCs/>
         </w:rPr>
-        <w:t>Client Background:</w:t>
-      </w:r>
-    </w:p>
-    <w:p>
-      <w:proofErr w:type="spellStart"/>
-      <w:r>
-        <w:t>Stravaco</w:t>
-      </w:r>
-      <w:proofErr w:type="spellEnd"/>
-      <w:r>
-        <w:t xml:space="preserve"> is</w:t>
-      </w:r>
-      <w:r>
-        <w:t xml:space="preserve"> a </w:t>
-      </w:r>
-      <w:r>
-        <w:t xml:space="preserve">NH based </w:t>
-      </w:r>
-      <w:r>
-        <w:t>tech startup</w:t>
-      </w:r>
-      <w:r>
-        <w:t xml:space="preserve"> </w:t>
-      </w:r>
-      <w:r>
-        <w:t>that recently launched a fitness tracking application.</w:t>
-      </w:r>
-    </w:p>
-    <w:p>
-      <w:r>
-        <w:t>They've been using AWS for three months, initially setting up their infrastructure quickly to meet launch deadlines.</w:t>
-      </w:r>
-    </w:p>
-    <w:p>
-      <w:r>
-        <w:t>But n</w:t>
-      </w:r>
-      <w:r>
-        <w:t>ow that th</w:t>
-      </w:r>
-      <w:r>
-        <w:t>e</w:t>
-      </w:r>
-      <w:r>
-        <w:t xml:space="preserve"> product is live, they need to address their cloud security fundamentals.  The company has 10 employees who all currently share the AWS root account credentials to access and manage their cloud resources.</w:t>
-      </w:r>
-    </w:p>
-    <w:p>
-      <w:r>
-        <w:t xml:space="preserve">This practice started when they were moving quickly to launch, but now their </w:t>
-      </w:r>
-      <w:r>
-        <w:t xml:space="preserve">(new) </w:t>
-      </w:r>
-      <w:r>
-        <w:t>CTO recognizes the security risks this poses.</w:t>
-      </w:r>
-    </w:p>
-    <w:p>
+        <w:t>Current Setup</w:t>
+      </w:r>
       <w:r>
         <w:rPr>
           <w:b/>
           <w:bCs/>
         </w:rPr>
-        <w:t>Current Setup:</w:t>
+        <w:t xml:space="preserve"> that needs to be evaluated</w:t>
+      </w:r>
+      <w:r>
+        <w:rPr>
+          <w:b/>
+          <w:bCs/>
+        </w:rPr>
+        <w:t>:</w:t>
       </w:r>
     </w:p>
     <w:p>
@@ -127,6 +161,7 @@
           <w:ilvl w:val="0"/>
           <w:numId w:val="1"/>
         </w:numPr>
+        <w:spacing w:after="0"/>
       </w:pPr>
       <w:r>
         <w:t>Everyone uses the root account</w:t>
@@ -138,6 +173,7 @@
           <w:ilvl w:val="0"/>
           <w:numId w:val="1"/>
         </w:numPr>
+        <w:spacing w:after="0"/>
       </w:pPr>
       <w:r>
         <w:t>No separate permissions for different teams</w:t>
@@ -149,6 +185,7 @@
           <w:ilvl w:val="0"/>
           <w:numId w:val="1"/>
         </w:numPr>
+        <w:spacing w:after="0"/>
       </w:pPr>
       <w:r>
         <w:t>No MFA or password policies</w:t>
@@ -160,10 +197,17 @@
           <w:ilvl w:val="0"/>
           <w:numId w:val="1"/>
         </w:numPr>
+        <w:spacing w:after="0"/>
       </w:pPr>
       <w:r>
         <w:t>AWS credentials shared via team chat</w:t>
       </w:r>
+    </w:p>
+    <w:p>
+      <w:pPr>
+        <w:spacing w:after="0"/>
+        <w:ind w:left="360"/>
+      </w:pPr>
     </w:p>
     <w:p>
       <w:r>
@@ -180,6 +224,7 @@
           <w:ilvl w:val="0"/>
           <w:numId w:val="2"/>
         </w:numPr>
+        <w:spacing w:after="0"/>
       </w:pPr>
       <w:r>
         <w:t>EC2 instances running their application</w:t>
@@ -191,6 +236,7 @@
           <w:ilvl w:val="0"/>
           <w:numId w:val="2"/>
         </w:numPr>
+        <w:spacing w:after="0"/>
       </w:pPr>
       <w:r>
         <w:t>S3 buckets storing user data and application assets</w:t>
@@ -202,6 +248,7 @@
           <w:ilvl w:val="0"/>
           <w:numId w:val="2"/>
         </w:numPr>
+        <w:spacing w:after="0"/>
       </w:pPr>
       <w:r>
         <w:t>RDS database for user information</w:t>
@@ -213,6 +260,7 @@
           <w:ilvl w:val="0"/>
           <w:numId w:val="2"/>
         </w:numPr>
+        <w:spacing w:after="0"/>
       </w:pPr>
       <w:r>
         <w:t>CloudWatch for monitoring</w:t>
@@ -224,10 +272,17 @@
           <w:ilvl w:val="0"/>
           <w:numId w:val="2"/>
         </w:numPr>
+        <w:spacing w:after="0"/>
       </w:pPr>
       <w:r>
         <w:t>Several development and production environments</w:t>
       </w:r>
+    </w:p>
+    <w:p>
+      <w:pPr>
+        <w:spacing w:after="0"/>
+        <w:ind w:left="360"/>
+      </w:pPr>
     </w:p>
     <w:p>
       <w:r>
@@ -235,7 +290,21 @@
           <w:b/>
           <w:bCs/>
         </w:rPr>
-        <w:t>Team Structure &amp; Access Needs:</w:t>
+        <w:t>Team Structure &amp; Access Needs</w:t>
+      </w:r>
+      <w:r>
+        <w:rPr>
+          <w:b/>
+          <w:bCs/>
+        </w:rPr>
+        <w:t xml:space="preserve"> (see spreadsheet for details)</w:t>
+      </w:r>
+      <w:r>
+        <w:rPr>
+          <w:b/>
+          <w:bCs/>
+        </w:rPr>
+        <w:t>:</w:t>
       </w:r>
       <w:r>
         <w:t> </w:t>
@@ -247,9 +316,16 @@
           <w:ilvl w:val="0"/>
           <w:numId w:val="3"/>
         </w:numPr>
-      </w:pPr>
-      <w:r>
-        <w:t>  4 Developers (need EC2 and S3 access)</w:t>
+        <w:spacing w:after="0"/>
+      </w:pPr>
+      <w:r>
+        <w:t xml:space="preserve">4 Developers </w:t>
+      </w:r>
+      <w:r>
+        <w:t xml:space="preserve">who </w:t>
+      </w:r>
+      <w:r>
+        <w:t>need EC2 and S3 access</w:t>
       </w:r>
     </w:p>
     <w:p>
@@ -258,9 +334,16 @@
           <w:ilvl w:val="0"/>
           <w:numId w:val="3"/>
         </w:numPr>
-      </w:pPr>
-      <w:r>
-        <w:t> 2 Operations (need full infrastructure access)</w:t>
+        <w:spacing w:after="0"/>
+      </w:pPr>
+      <w:r>
+        <w:t>2 Operations</w:t>
+      </w:r>
+      <w:r>
+        <w:t xml:space="preserve"> folks who </w:t>
+      </w:r>
+      <w:r>
+        <w:t>need full infrastructure access</w:t>
       </w:r>
     </w:p>
     <w:p>
@@ -269,9 +352,16 @@
           <w:ilvl w:val="0"/>
           <w:numId w:val="3"/>
         </w:numPr>
-      </w:pPr>
-      <w:r>
-        <w:t> 1 Finance Manager (needs cost management access)</w:t>
+        <w:spacing w:after="0"/>
+      </w:pPr>
+      <w:r>
+        <w:t>1 Finance Manager</w:t>
+      </w:r>
+      <w:r>
+        <w:t xml:space="preserve"> who </w:t>
+      </w:r>
+      <w:r>
+        <w:t>needs cost management access</w:t>
       </w:r>
     </w:p>
     <w:p>
@@ -280,63 +370,98 @@
           <w:ilvl w:val="0"/>
           <w:numId w:val="3"/>
         </w:numPr>
-      </w:pPr>
-      <w:r>
-        <w:t> 3 Data Analysts (need read-only access to data resources)</w:t>
-      </w:r>
-    </w:p>
-    <w:p>
-      <w:pPr>
+        <w:spacing w:after="0"/>
+      </w:pPr>
+      <w:r>
+        <w:t xml:space="preserve">3 Data Analysts </w:t>
+      </w:r>
+      <w:r>
+        <w:t xml:space="preserve">who </w:t>
+      </w:r>
+      <w:r>
+        <w:t>need read-only access to data resources</w:t>
+      </w:r>
+    </w:p>
+    <w:p>
+      <w:pPr>
+        <w:numPr>
+          <w:ilvl w:val="0"/>
+          <w:numId w:val="3"/>
+        </w:numPr>
+        <w:spacing w:after="0"/>
+      </w:pPr>
+      <w:r>
+        <w:t>1 A</w:t>
+      </w:r>
+      <w:r>
+        <w:t>rchitect who will be the main Administrator on the AWS account</w:t>
+      </w:r>
+    </w:p>
+    <w:p>
+      <w:pPr>
+        <w:spacing w:after="0"/>
+        <w:ind w:left="360"/>
+      </w:pPr>
+    </w:p>
+    <w:p>
+      <w:r>
         <w:rPr>
           <w:b/>
           <w:bCs/>
         </w:rPr>
-      </w:pPr>
+        <w:t>Deliverable 1: Architecture diagram of current state</w:t>
+      </w:r>
+    </w:p>
+    <w:p>
+      <w:pPr>
+        <w:numPr>
+          <w:ilvl w:val="0"/>
+          <w:numId w:val="4"/>
+        </w:numPr>
+        <w:spacing w:after="0"/>
+      </w:pPr>
+      <w:r>
+        <w:t xml:space="preserve">Create </w:t>
+      </w:r>
+      <w:proofErr w:type="gramStart"/>
+      <w:r>
+        <w:t>a</w:t>
+      </w:r>
+      <w:proofErr w:type="gramEnd"/>
+      <w:r>
+        <w:t xml:space="preserve"> architecture diagram showcasing their current infrastructure</w:t>
+      </w:r>
+    </w:p>
+    <w:p/>
+    <w:p>
       <w:r>
         <w:rPr>
           <w:b/>
           <w:bCs/>
         </w:rPr>
-        <w:t>--------- Your Task ---------</w:t>
-      </w:r>
-    </w:p>
-    <w:p>
+        <w:lastRenderedPageBreak/>
+        <w:t xml:space="preserve">Deliverable </w:t>
+      </w:r>
       <w:r>
         <w:rPr>
           <w:b/>
           <w:bCs/>
         </w:rPr>
-        <w:lastRenderedPageBreak/>
-        <w:t>1 - Create their Architecture</w:t>
-      </w:r>
-    </w:p>
-    <w:p>
-      <w:pPr>
-        <w:numPr>
-          <w:ilvl w:val="0"/>
-          <w:numId w:val="4"/>
-        </w:numPr>
-      </w:pPr>
-      <w:r>
-        <w:t xml:space="preserve">Create </w:t>
-      </w:r>
-      <w:proofErr w:type="gramStart"/>
-      <w:r>
-        <w:t>a</w:t>
-      </w:r>
-      <w:proofErr w:type="gramEnd"/>
-      <w:r>
-        <w:t xml:space="preserve"> architecture diagram showcasing their current infrastructure</w:t>
-      </w:r>
-    </w:p>
-    <w:p/>
-    <w:p>
+        <w:t>2</w:t>
+      </w:r>
       <w:r>
         <w:rPr>
           <w:b/>
           <w:bCs/>
         </w:rPr>
-        <w:t>2 - Secure the Root Account</w:t>
+        <w:t>: Resolving the issues with</w:t>
+      </w:r>
+      <w:r>
+        <w:rPr>
+          <w:b/>
+          <w:bCs/>
+        </w:rPr>
+        <w:t xml:space="preserve"> the Root Account</w:t>
       </w:r>
     </w:p>
     <w:p>
@@ -345,9 +470,13 @@
           <w:ilvl w:val="0"/>
           <w:numId w:val="5"/>
         </w:numPr>
+        <w:spacing w:after="0"/>
       </w:pPr>
       <w:r>
         <w:t>Enable MFA</w:t>
+      </w:r>
+      <w:r>
+        <w:t xml:space="preserve"> (for all users, not just root account)</w:t>
       </w:r>
     </w:p>
     <w:p>
@@ -356,6 +485,7 @@
           <w:ilvl w:val="0"/>
           <w:numId w:val="5"/>
         </w:numPr>
+        <w:spacing w:after="0"/>
       </w:pPr>
       <w:r>
         <w:t>Stop using it for daily operations</w:t>
@@ -367,6 +497,7 @@
           <w:ilvl w:val="0"/>
           <w:numId w:val="5"/>
         </w:numPr>
+        <w:spacing w:after="0"/>
       </w:pPr>
       <w:r>
         <w:t>Store credentials securely</w:t>
@@ -379,7 +510,28 @@
           <w:b/>
           <w:bCs/>
         </w:rPr>
-        <w:t>3 - Create IAM Users and Groups</w:t>
+        <w:t xml:space="preserve">Deliverable </w:t>
+      </w:r>
+      <w:r>
+        <w:rPr>
+          <w:b/>
+          <w:bCs/>
+        </w:rPr>
+        <w:t>3</w:t>
+      </w:r>
+      <w:r>
+        <w:rPr>
+          <w:b/>
+          <w:bCs/>
+        </w:rPr>
+        <w:t xml:space="preserve">: </w:t>
+      </w:r>
+      <w:r>
+        <w:rPr>
+          <w:b/>
+          <w:bCs/>
+        </w:rPr>
+        <w:t>Create IAM Users and Groups</w:t>
       </w:r>
     </w:p>
     <w:p>
@@ -388,9 +540,21 @@
           <w:ilvl w:val="0"/>
           <w:numId w:val="6"/>
         </w:numPr>
+        <w:spacing w:after="0"/>
       </w:pPr>
       <w:r>
         <w:t>Developer group &amp; users</w:t>
+      </w:r>
+      <w:r>
+        <w:t xml:space="preserve"> (</w:t>
+      </w:r>
+      <w:proofErr w:type="spellStart"/>
+      <w:r>
+        <w:t>Developer_Group</w:t>
+      </w:r>
+      <w:proofErr w:type="spellEnd"/>
+      <w:r>
+        <w:t>)</w:t>
       </w:r>
     </w:p>
     <w:p>
@@ -399,9 +563,21 @@
           <w:ilvl w:val="0"/>
           <w:numId w:val="6"/>
         </w:numPr>
+        <w:spacing w:after="0"/>
       </w:pPr>
       <w:r>
         <w:t>Operations group &amp; users</w:t>
+      </w:r>
+      <w:r>
+        <w:t xml:space="preserve"> (</w:t>
+      </w:r>
+      <w:proofErr w:type="spellStart"/>
+      <w:r>
+        <w:t>Ops_Group</w:t>
+      </w:r>
+      <w:proofErr w:type="spellEnd"/>
+      <w:r>
+        <w:t>)</w:t>
       </w:r>
     </w:p>
     <w:p>
@@ -410,9 +586,21 @@
           <w:ilvl w:val="0"/>
           <w:numId w:val="6"/>
         </w:numPr>
+        <w:spacing w:after="0"/>
       </w:pPr>
       <w:r>
         <w:t>Finance group &amp; user</w:t>
+      </w:r>
+      <w:r>
+        <w:t xml:space="preserve"> (</w:t>
+      </w:r>
+      <w:proofErr w:type="spellStart"/>
+      <w:r>
+        <w:t>Finance_Group</w:t>
+      </w:r>
+      <w:proofErr w:type="spellEnd"/>
+      <w:r>
+        <w:t>)</w:t>
       </w:r>
     </w:p>
     <w:p>
@@ -421,9 +609,41 @@
           <w:ilvl w:val="0"/>
           <w:numId w:val="6"/>
         </w:numPr>
+        <w:spacing w:after="0"/>
       </w:pPr>
       <w:r>
         <w:t>Analyst group &amp; users</w:t>
+      </w:r>
+      <w:r>
+        <w:t xml:space="preserve"> (</w:t>
+      </w:r>
+      <w:proofErr w:type="spellStart"/>
+      <w:r>
+        <w:t>Data_Group</w:t>
+      </w:r>
+      <w:proofErr w:type="spellEnd"/>
+      <w:r>
+        <w:t>)</w:t>
+      </w:r>
+    </w:p>
+    <w:p>
+      <w:pPr>
+        <w:numPr>
+          <w:ilvl w:val="0"/>
+          <w:numId w:val="6"/>
+        </w:numPr>
+        <w:spacing w:after="0"/>
+      </w:pPr>
+      <w:r>
+        <w:t>Administrator group &amp; users (</w:t>
+      </w:r>
+      <w:proofErr w:type="spellStart"/>
+      <w:r>
+        <w:t>Admin_Group</w:t>
+      </w:r>
+      <w:proofErr w:type="spellEnd"/>
+      <w:r>
+        <w:t>)</w:t>
       </w:r>
     </w:p>
     <w:p/>
@@ -433,7 +653,35 @@
           <w:b/>
           <w:bCs/>
         </w:rPr>
-        <w:t>4 - Set Up Security Requirements</w:t>
+        <w:t xml:space="preserve">Deliverable </w:t>
+      </w:r>
+      <w:r>
+        <w:rPr>
+          <w:b/>
+          <w:bCs/>
+        </w:rPr>
+        <w:t>4</w:t>
+      </w:r>
+      <w:r>
+        <w:rPr>
+          <w:b/>
+          <w:bCs/>
+        </w:rPr>
+        <w:t>: General Best</w:t>
+      </w:r>
+      <w:r>
+        <w:rPr>
+          <w:b/>
+          <w:bCs/>
+        </w:rPr>
+        <w:t xml:space="preserve"> Security </w:t>
+      </w:r>
+      <w:r>
+        <w:rPr>
+          <w:b/>
+          <w:bCs/>
+        </w:rPr>
+        <w:t>Practice implementation</w:t>
       </w:r>
     </w:p>
     <w:p>
@@ -442,6 +690,7 @@
           <w:ilvl w:val="0"/>
           <w:numId w:val="7"/>
         </w:numPr>
+        <w:spacing w:after="0"/>
       </w:pPr>
       <w:r>
         <w:t>Enable MFA for all users</w:t>
@@ -453,6 +702,7 @@
           <w:ilvl w:val="0"/>
           <w:numId w:val="7"/>
         </w:numPr>
+        <w:spacing w:after="0"/>
       </w:pPr>
       <w:r>
         <w:t>Create a strong password policy</w:t>
@@ -464,6 +714,7 @@
           <w:ilvl w:val="0"/>
           <w:numId w:val="7"/>
         </w:numPr>
+        <w:spacing w:after="0"/>
       </w:pPr>
       <w:r>
         <w:t>Ensure users can only access what they need</w:t>
@@ -476,15 +727,57 @@
           <w:b/>
           <w:bCs/>
         </w:rPr>
-        <w:t>5 - Implement These Permissions</w:t>
-      </w:r>
-    </w:p>
-    <w:p>
+        <w:t xml:space="preserve">Deliverable </w:t>
+      </w:r>
       <w:r>
         <w:rPr>
           <w:b/>
           <w:bCs/>
         </w:rPr>
+        <w:t>5</w:t>
+      </w:r>
+      <w:r>
+        <w:rPr>
+          <w:b/>
+          <w:bCs/>
+        </w:rPr>
+        <w:t xml:space="preserve">: </w:t>
+      </w:r>
+      <w:r>
+        <w:rPr>
+          <w:b/>
+          <w:bCs/>
+        </w:rPr>
+        <w:t xml:space="preserve">Implement </w:t>
+      </w:r>
+      <w:r>
+        <w:rPr>
+          <w:b/>
+          <w:bCs/>
+        </w:rPr>
+        <w:t>p</w:t>
+      </w:r>
+      <w:r>
+        <w:rPr>
+          <w:b/>
+          <w:bCs/>
+        </w:rPr>
+        <w:t>ermissions</w:t>
+      </w:r>
+      <w:r>
+        <w:rPr>
+          <w:b/>
+          <w:bCs/>
+        </w:rPr>
+        <w:t xml:space="preserve"> at group level</w:t>
+      </w:r>
+    </w:p>
+    <w:p>
+      <w:r>
+        <w:rPr>
+          <w:b/>
+          <w:bCs/>
+        </w:rPr>
         <w:t>Developers:</w:t>
       </w:r>
     </w:p>
@@ -494,9 +787,13 @@
           <w:ilvl w:val="0"/>
           <w:numId w:val="8"/>
         </w:numPr>
+        <w:spacing w:after="0"/>
       </w:pPr>
       <w:r>
         <w:t>EC2 management</w:t>
+      </w:r>
+      <w:r>
+        <w:t>: AmazonEC2FullAccess</w:t>
       </w:r>
     </w:p>
     <w:p>
@@ -505,9 +802,13 @@
           <w:ilvl w:val="0"/>
           <w:numId w:val="8"/>
         </w:numPr>
+        <w:spacing w:after="0"/>
       </w:pPr>
       <w:r>
         <w:t>S3 access for application files</w:t>
+      </w:r>
+      <w:r>
+        <w:t>: AmazonS3ReadOnlyAccess</w:t>
       </w:r>
     </w:p>
     <w:p>
@@ -516,10 +817,25 @@
           <w:ilvl w:val="0"/>
           <w:numId w:val="8"/>
         </w:numPr>
+        <w:spacing w:after="0"/>
       </w:pPr>
       <w:r>
         <w:t>CloudWatch logs viewing</w:t>
       </w:r>
+      <w:r>
+        <w:t xml:space="preserve">: </w:t>
+      </w:r>
+      <w:proofErr w:type="spellStart"/>
+      <w:r>
+        <w:t>CloudWatchEventsFullAccess</w:t>
+      </w:r>
+      <w:proofErr w:type="spellEnd"/>
+    </w:p>
+    <w:p>
+      <w:pPr>
+        <w:spacing w:after="0"/>
+        <w:ind w:left="360"/>
+      </w:pPr>
     </w:p>
     <w:p>
       <w:r>
@@ -536,9 +852,13 @@
           <w:ilvl w:val="0"/>
           <w:numId w:val="9"/>
         </w:numPr>
-      </w:pPr>
-      <w:r>
-        <w:t>Full EC2, CloudWatch access</w:t>
+        <w:spacing w:after="0"/>
+      </w:pPr>
+      <w:r>
+        <w:t>Full EC2</w:t>
+      </w:r>
+      <w:r>
+        <w:t>: AmazonEC2FullAccess</w:t>
       </w:r>
     </w:p>
     <w:p>
@@ -547,11 +867,19 @@
           <w:ilvl w:val="0"/>
           <w:numId w:val="9"/>
         </w:numPr>
-      </w:pPr>
-      <w:r>
-        <w:lastRenderedPageBreak/>
-        <w:t>Systems Manager access</w:t>
-      </w:r>
+        <w:spacing w:after="0"/>
+      </w:pPr>
+      <w:r>
+        <w:t>CloudWatch access</w:t>
+      </w:r>
+      <w:r>
+        <w:t xml:space="preserve">: </w:t>
+      </w:r>
+      <w:proofErr w:type="spellStart"/>
+      <w:r>
+        <w:t>CloudWatchEventsFullAccess</w:t>
+      </w:r>
+      <w:proofErr w:type="spellEnd"/>
     </w:p>
     <w:p>
       <w:pPr>
@@ -559,10 +887,51 @@
           <w:ilvl w:val="0"/>
           <w:numId w:val="9"/>
         </w:numPr>
+        <w:spacing w:after="0"/>
+      </w:pPr>
+      <w:r>
+        <w:t>Systems Manager acce</w:t>
+      </w:r>
+      <w:r>
+        <w:t>s</w:t>
+      </w:r>
+      <w:r>
+        <w:t>s</w:t>
+      </w:r>
+      <w:r>
+        <w:t xml:space="preserve">: </w:t>
+      </w:r>
+      <w:proofErr w:type="spellStart"/>
+      <w:r>
+        <w:t>AmazonSSMFullAccess</w:t>
+      </w:r>
+      <w:proofErr w:type="spellEnd"/>
+    </w:p>
+    <w:p>
+      <w:pPr>
+        <w:numPr>
+          <w:ilvl w:val="0"/>
+          <w:numId w:val="9"/>
+        </w:numPr>
+        <w:spacing w:after="0"/>
       </w:pPr>
       <w:r>
         <w:t>RDS management</w:t>
       </w:r>
+      <w:r>
+        <w:t xml:space="preserve">: </w:t>
+      </w:r>
+      <w:proofErr w:type="spellStart"/>
+      <w:r>
+        <w:t>AmazonRDSFullAccess</w:t>
+      </w:r>
+      <w:proofErr w:type="spellEnd"/>
+    </w:p>
+    <w:p>
+      <w:pPr>
+        <w:spacing w:after="0"/>
+        <w:ind w:left="360"/>
+      </w:pPr>
     </w:p>
     <w:p>
       <w:r>
@@ -579,9 +948,13 @@
           <w:ilvl w:val="0"/>
           <w:numId w:val="10"/>
         </w:numPr>
+        <w:spacing w:after="0"/>
       </w:pPr>
       <w:r>
         <w:t>Cost Explorer</w:t>
+      </w:r>
+      <w:r>
+        <w:t>: Billing</w:t>
       </w:r>
     </w:p>
     <w:p>
@@ -590,9 +963,13 @@
           <w:ilvl w:val="0"/>
           <w:numId w:val="10"/>
         </w:numPr>
+        <w:spacing w:after="0"/>
       </w:pPr>
       <w:r>
         <w:t>AWS Budgets</w:t>
+      </w:r>
+      <w:r>
+        <w:t>: Billing</w:t>
       </w:r>
     </w:p>
     <w:p>
@@ -601,10 +978,19 @@
           <w:ilvl w:val="0"/>
           <w:numId w:val="10"/>
         </w:numPr>
+        <w:spacing w:after="0"/>
       </w:pPr>
       <w:r>
         <w:t>Read-only resource access</w:t>
       </w:r>
+      <w:r>
+        <w:t xml:space="preserve">: </w:t>
+      </w:r>
+      <w:proofErr w:type="spellStart"/>
+      <w:r>
+        <w:t>ReadOnlyAccess</w:t>
+      </w:r>
+      <w:proofErr w:type="spellEnd"/>
     </w:p>
     <w:p>
       <w:r>
@@ -612,6 +998,7 @@
           <w:b/>
           <w:bCs/>
         </w:rPr>
+        <w:lastRenderedPageBreak/>
         <w:t>Analysts:</w:t>
       </w:r>
     </w:p>
@@ -621,9 +1008,13 @@
           <w:ilvl w:val="0"/>
           <w:numId w:val="11"/>
         </w:numPr>
+        <w:spacing w:after="0"/>
       </w:pPr>
       <w:r>
         <w:t>Read-only S3 access</w:t>
+      </w:r>
+      <w:r>
+        <w:t>: AmazonS3ReadOnlyAccess</w:t>
       </w:r>
     </w:p>
     <w:p>
@@ -632,10 +1023,19 @@
           <w:ilvl w:val="0"/>
           <w:numId w:val="11"/>
         </w:numPr>
+        <w:spacing w:after="0"/>
       </w:pPr>
       <w:r>
         <w:t>Read-only database access</w:t>
       </w:r>
+      <w:r>
+        <w:t xml:space="preserve">: </w:t>
+      </w:r>
+      <w:proofErr w:type="spellStart"/>
+      <w:r>
+        <w:t>AmazonRDSReadOnlyAccess</w:t>
+      </w:r>
+      <w:proofErr w:type="spellEnd"/>
     </w:p>
     <w:p>
       <w:pPr>
@@ -644,21 +1044,28 @@
           <w:bCs/>
         </w:rPr>
       </w:pPr>
+    </w:p>
+    <w:p>
       <w:r>
         <w:rPr>
           <w:b/>
           <w:bCs/>
         </w:rPr>
-        <w:t>--------- What to Submit ---------</w:t>
-      </w:r>
-    </w:p>
-    <w:p>
+        <w:t xml:space="preserve">Actions taken – </w:t>
+      </w:r>
       <w:r>
         <w:rPr>
           <w:b/>
           <w:bCs/>
         </w:rPr>
-        <w:t>Documentation and Screenshots</w:t>
+        <w:t>Documentation</w:t>
+      </w:r>
+      <w:r>
+        <w:rPr>
+          <w:b/>
+          <w:bCs/>
+        </w:rPr>
+        <w:tab/>
       </w:r>
     </w:p>
     <w:p>
@@ -672,6 +1079,7 @@
         <w:t>Clear Documentation explaining the problem you faced, what you did to overcome it, with the Architecture you created</w:t>
       </w:r>
     </w:p>
+    <w:p/>
     <w:p>
       <w:pPr>
         <w:numPr>
@@ -680,7 +1088,13 @@
         </w:numPr>
       </w:pPr>
       <w:r>
-        <w:t>In the documentation include screenshots showing:</w:t>
+        <w:t>Addressing the r</w:t>
+      </w:r>
+      <w:r>
+        <w:t>oot user account used to set up the account</w:t>
+      </w:r>
+      <w:r>
+        <w:t>, and the shared use of this</w:t>
       </w:r>
     </w:p>
     <w:p>
@@ -691,15 +1105,14 @@
         </w:numPr>
       </w:pPr>
       <w:r>
-        <w:t xml:space="preserve">Your IAM groups and </w:t>
-      </w:r>
-      <w:proofErr w:type="gramStart"/>
-      <w:r>
-        <w:t>users</w:t>
-      </w:r>
-      <w:proofErr w:type="gramEnd"/>
-      <w:r>
-        <w:t xml:space="preserve"> structure</w:t>
+        <w:rPr>
+          <w:b/>
+          <w:bCs/>
+        </w:rPr>
+        <w:t>Issue</w:t>
+      </w:r>
+      <w:r>
+        <w:t>: This was previously shared among the team members.</w:t>
       </w:r>
     </w:p>
     <w:p>
@@ -710,41 +1123,935 @@
         </w:numPr>
       </w:pPr>
       <w:r>
-        <w:t>MFA and password policies</w:t>
-      </w:r>
-    </w:p>
-    <w:p>
-      <w:pPr>
-        <w:numPr>
-          <w:ilvl w:val="1"/>
+        <w:rPr>
+          <w:b/>
+          <w:bCs/>
+        </w:rPr>
+        <w:t>Fix</w:t>
+      </w:r>
+      <w:r>
+        <w:t xml:space="preserve">: </w:t>
+      </w:r>
+    </w:p>
+    <w:p>
+      <w:pPr>
+        <w:numPr>
+          <w:ilvl w:val="2"/>
           <w:numId w:val="12"/>
         </w:numPr>
       </w:pPr>
       <w:r>
-        <w:t>Example permissions for each group</w:t>
-      </w:r>
-    </w:p>
-    <w:p>
-      <w:pPr>
-        <w:numPr>
-          <w:ilvl w:val="1"/>
+        <w:t>Th</w:t>
+      </w:r>
+      <w:r>
+        <w:t>e</w:t>
+      </w:r>
+      <w:r>
+        <w:t xml:space="preserve"> root user for the management account is no longer used by the team –</w:t>
+      </w:r>
+      <w:r>
+        <w:t xml:space="preserve"> the</w:t>
+      </w:r>
+      <w:r>
+        <w:t xml:space="preserve"> password has been </w:t>
+      </w:r>
+      <w:r>
+        <w:t>changed using a very strong random character generator</w:t>
+      </w:r>
+      <w:r>
+        <w:t xml:space="preserve">, MFA </w:t>
+      </w:r>
+      <w:r>
+        <w:t xml:space="preserve">has been </w:t>
+      </w:r>
+      <w:r>
+        <w:t xml:space="preserve">enabled on the account and </w:t>
+      </w:r>
+      <w:r>
+        <w:t xml:space="preserve">the </w:t>
+      </w:r>
+      <w:r>
+        <w:t xml:space="preserve">root password + MFA recovery codes </w:t>
+      </w:r>
+      <w:r>
+        <w:t>are held</w:t>
+      </w:r>
+      <w:r>
+        <w:t xml:space="preserve"> a shared vault</w:t>
+      </w:r>
+      <w:r>
+        <w:t xml:space="preserve"> on 1Password</w:t>
+      </w:r>
+      <w:r>
+        <w:t xml:space="preserve"> with strict access controls.</w:t>
+      </w:r>
+      <w:r>
+        <w:t xml:space="preserve"> The current</w:t>
+      </w:r>
+      <w:r>
+        <w:t xml:space="preserve"> CTO, John Baptiste</w:t>
+      </w:r>
+      <w:r>
+        <w:t xml:space="preserve"> is investigating whether a hardware YubiKey might be an option to replace the google authenticator solution currently in place.</w:t>
+      </w:r>
+    </w:p>
+    <w:p>
+      <w:pPr>
+        <w:numPr>
+          <w:ilvl w:val="2"/>
           <w:numId w:val="12"/>
         </w:numPr>
       </w:pPr>
       <w:r>
-        <w:t>How you structure the permissions</w:t>
-      </w:r>
-    </w:p>
-    <w:p>
-      <w:pPr>
-        <w:numPr>
-          <w:ilvl w:val="1"/>
+        <w:t>Under AWS Organizations, another AWS Account was setup which will be used for all operational activities</w:t>
+      </w:r>
+    </w:p>
+    <w:p>
+      <w:pPr>
+        <w:pStyle w:val="ListParagraph"/>
+        <w:numPr>
+          <w:ilvl w:val="2"/>
           <w:numId w:val="12"/>
         </w:numPr>
       </w:pPr>
       <w:r>
-        <w:t>Why you made certain security choices</w:t>
-      </w:r>
+        <w:t xml:space="preserve">For the duration of the engagement, I set up a root user account for myself and enabled MFA </w:t>
+      </w:r>
+      <w:r>
+        <w:t xml:space="preserve">and the roles specified. At the end of the consultation engagement my access is removed by members of the </w:t>
+      </w:r>
+      <w:proofErr w:type="gramStart"/>
+      <w:r>
+        <w:t>Admin</w:t>
+      </w:r>
+      <w:proofErr w:type="gramEnd"/>
+      <w:r>
+        <w:t xml:space="preserve"> team</w:t>
+      </w:r>
+    </w:p>
+    <w:p>
+      <w:pPr>
+        <w:pStyle w:val="ListParagraph"/>
+        <w:numPr>
+          <w:ilvl w:val="2"/>
+          <w:numId w:val="12"/>
+        </w:numPr>
+      </w:pPr>
+      <w:r>
+        <w:t>Several groups were created with user members based on functional area. Least privilege was applied where possible, and standalone permissions rather than bundled were used where possible.  Notable exceptions are Billing related permissions which are bundled and interrelated</w:t>
+      </w:r>
+    </w:p>
+    <w:p>
+      <w:r>
+        <w:rPr>
+          <w:noProof/>
+        </w:rPr>
+        <w:lastRenderedPageBreak/>
+        <w:drawing>
+          <wp:inline distT="0" distB="0" distL="0" distR="0" wp14:anchorId="249E5360" wp14:editId="0CE736B6">
+            <wp:extent cx="5943600" cy="3086100"/>
+            <wp:effectExtent l="0" t="0" r="0" b="0"/>
+            <wp:docPr id="66850243" name="Picture 1"/>
+            <wp:cNvGraphicFramePr>
+              <a:graphicFrameLocks xmlns:a="http://schemas.openxmlformats.org/drawingml/2006/main" noChangeAspect="1"/>
+            </wp:cNvGraphicFramePr>
+            <a:graphic xmlns:a="http://schemas.openxmlformats.org/drawingml/2006/main">
+              <a:graphicData uri="http://schemas.openxmlformats.org/drawingml/2006/picture">
+                <pic:pic xmlns:pic="http://schemas.openxmlformats.org/drawingml/2006/picture">
+                  <pic:nvPicPr>
+                    <pic:cNvPr id="66850243" name=""/>
+                    <pic:cNvPicPr/>
+                  </pic:nvPicPr>
+                  <pic:blipFill>
+                    <a:blip r:embed="rId5"/>
+                    <a:stretch>
+                      <a:fillRect/>
+                    </a:stretch>
+                  </pic:blipFill>
+                  <pic:spPr>
+                    <a:xfrm>
+                      <a:off x="0" y="0"/>
+                      <a:ext cx="5943600" cy="3086100"/>
+                    </a:xfrm>
+                    <a:prstGeom prst="rect">
+                      <a:avLst/>
+                    </a:prstGeom>
+                  </pic:spPr>
+                </pic:pic>
+              </a:graphicData>
+            </a:graphic>
+          </wp:inline>
+        </w:drawing>
+      </w:r>
+    </w:p>
+    <w:p>
+      <w:r>
+        <w:rPr>
+          <w:noProof/>
+        </w:rPr>
+        <w:drawing>
+          <wp:inline distT="0" distB="0" distL="0" distR="0" wp14:anchorId="79ECF2E9" wp14:editId="122FD23A">
+            <wp:extent cx="2400635" cy="1914792"/>
+            <wp:effectExtent l="0" t="0" r="0" b="9525"/>
+            <wp:docPr id="533911218" name="Picture 1"/>
+            <wp:cNvGraphicFramePr>
+              <a:graphicFrameLocks xmlns:a="http://schemas.openxmlformats.org/drawingml/2006/main" noChangeAspect="1"/>
+            </wp:cNvGraphicFramePr>
+            <a:graphic xmlns:a="http://schemas.openxmlformats.org/drawingml/2006/main">
+              <a:graphicData uri="http://schemas.openxmlformats.org/drawingml/2006/picture">
+                <pic:pic xmlns:pic="http://schemas.openxmlformats.org/drawingml/2006/picture">
+                  <pic:nvPicPr>
+                    <pic:cNvPr id="533911218" name=""/>
+                    <pic:cNvPicPr/>
+                  </pic:nvPicPr>
+                  <pic:blipFill>
+                    <a:blip r:embed="rId6"/>
+                    <a:stretch>
+                      <a:fillRect/>
+                    </a:stretch>
+                  </pic:blipFill>
+                  <pic:spPr>
+                    <a:xfrm>
+                      <a:off x="0" y="0"/>
+                      <a:ext cx="2400635" cy="1914792"/>
+                    </a:xfrm>
+                    <a:prstGeom prst="rect">
+                      <a:avLst/>
+                    </a:prstGeom>
+                  </pic:spPr>
+                </pic:pic>
+              </a:graphicData>
+            </a:graphic>
+          </wp:inline>
+        </w:drawing>
+      </w:r>
+    </w:p>
+    <w:p>
+      <w:pPr>
+        <w:numPr>
+          <w:ilvl w:val="2"/>
+          <w:numId w:val="12"/>
+        </w:numPr>
+      </w:pPr>
+      <w:r>
+        <w:t>The Chief architect will be the only member of the Admin</w:t>
+      </w:r>
+      <w:r>
+        <w:t xml:space="preserve"> Team</w:t>
+      </w:r>
+      <w:r>
+        <w:t xml:space="preserve"> currently, although that will likely change in the future.  The </w:t>
+      </w:r>
+      <w:r>
+        <w:t xml:space="preserve">associated AWS </w:t>
+      </w:r>
+      <w:proofErr w:type="spellStart"/>
+      <w:r>
+        <w:t>Admin_Group</w:t>
+      </w:r>
+      <w:proofErr w:type="spellEnd"/>
+      <w:r>
+        <w:t xml:space="preserve"> has the </w:t>
+      </w:r>
+      <w:proofErr w:type="spellStart"/>
+      <w:r>
+        <w:rPr>
+          <w:b/>
+          <w:bCs/>
+        </w:rPr>
+        <w:t>AdministratorAccess</w:t>
+      </w:r>
+      <w:proofErr w:type="spellEnd"/>
+      <w:r>
+        <w:rPr>
+          <w:b/>
+          <w:bCs/>
+        </w:rPr>
+        <w:t xml:space="preserve"> </w:t>
+      </w:r>
+      <w:r>
+        <w:t xml:space="preserve">and </w:t>
+      </w:r>
+      <w:r>
+        <w:rPr>
+          <w:b/>
+          <w:bCs/>
+        </w:rPr>
+        <w:t>Billing</w:t>
+      </w:r>
+      <w:r>
+        <w:t xml:space="preserve"> permissions</w:t>
+      </w:r>
+    </w:p>
+    <w:p>
+      <w:r>
+        <w:rPr>
+          <w:noProof/>
+        </w:rPr>
+        <w:lastRenderedPageBreak/>
+        <w:drawing>
+          <wp:inline distT="0" distB="0" distL="0" distR="0" wp14:anchorId="7A197D6C" wp14:editId="56AF988F">
+            <wp:extent cx="5943600" cy="3312160"/>
+            <wp:effectExtent l="0" t="0" r="0" b="2540"/>
+            <wp:docPr id="211134813" name="Picture 1"/>
+            <wp:cNvGraphicFramePr>
+              <a:graphicFrameLocks xmlns:a="http://schemas.openxmlformats.org/drawingml/2006/main" noChangeAspect="1"/>
+            </wp:cNvGraphicFramePr>
+            <a:graphic xmlns:a="http://schemas.openxmlformats.org/drawingml/2006/main">
+              <a:graphicData uri="http://schemas.openxmlformats.org/drawingml/2006/picture">
+                <pic:pic xmlns:pic="http://schemas.openxmlformats.org/drawingml/2006/picture">
+                  <pic:nvPicPr>
+                    <pic:cNvPr id="211134813" name=""/>
+                    <pic:cNvPicPr/>
+                  </pic:nvPicPr>
+                  <pic:blipFill>
+                    <a:blip r:embed="rId7"/>
+                    <a:stretch>
+                      <a:fillRect/>
+                    </a:stretch>
+                  </pic:blipFill>
+                  <pic:spPr>
+                    <a:xfrm>
+                      <a:off x="0" y="0"/>
+                      <a:ext cx="5943600" cy="3312160"/>
+                    </a:xfrm>
+                    <a:prstGeom prst="rect">
+                      <a:avLst/>
+                    </a:prstGeom>
+                  </pic:spPr>
+                </pic:pic>
+              </a:graphicData>
+            </a:graphic>
+          </wp:inline>
+        </w:drawing>
+      </w:r>
+    </w:p>
+    <w:p>
+      <w:pPr>
+        <w:numPr>
+          <w:ilvl w:val="2"/>
+          <w:numId w:val="12"/>
+        </w:numPr>
+      </w:pPr>
+      <w:r>
+        <w:t xml:space="preserve">The operations team will operate as Administrators for </w:t>
+      </w:r>
+      <w:proofErr w:type="spellStart"/>
+      <w:r>
+        <w:t>Stravaco</w:t>
+      </w:r>
+      <w:proofErr w:type="spellEnd"/>
+      <w:r>
+        <w:t xml:space="preserve">, and the two members of the team have been set as members of the </w:t>
+      </w:r>
+      <w:r>
+        <w:t xml:space="preserve">AWS </w:t>
+      </w:r>
+      <w:proofErr w:type="spellStart"/>
+      <w:r>
+        <w:rPr>
+          <w:b/>
+          <w:bCs/>
+        </w:rPr>
+        <w:t>Op</w:t>
+      </w:r>
+      <w:r>
+        <w:rPr>
+          <w:b/>
+          <w:bCs/>
+        </w:rPr>
+        <w:t>s</w:t>
+      </w:r>
+      <w:r>
+        <w:rPr>
+          <w:b/>
+          <w:bCs/>
+        </w:rPr>
+        <w:t>_Group</w:t>
+      </w:r>
+      <w:proofErr w:type="spellEnd"/>
+      <w:r>
+        <w:t>, which has the following permissions associated:</w:t>
+      </w:r>
+    </w:p>
+    <w:p>
+      <w:r>
+        <w:rPr>
+          <w:noProof/>
+        </w:rPr>
+        <w:drawing>
+          <wp:inline distT="0" distB="0" distL="0" distR="0" wp14:anchorId="5B679B5B" wp14:editId="04B2602C">
+            <wp:extent cx="5943600" cy="3622040"/>
+            <wp:effectExtent l="0" t="0" r="0" b="0"/>
+            <wp:docPr id="982731846" name="Picture 1"/>
+            <wp:cNvGraphicFramePr>
+              <a:graphicFrameLocks xmlns:a="http://schemas.openxmlformats.org/drawingml/2006/main" noChangeAspect="1"/>
+            </wp:cNvGraphicFramePr>
+            <a:graphic xmlns:a="http://schemas.openxmlformats.org/drawingml/2006/main">
+              <a:graphicData uri="http://schemas.openxmlformats.org/drawingml/2006/picture">
+                <pic:pic xmlns:pic="http://schemas.openxmlformats.org/drawingml/2006/picture">
+                  <pic:nvPicPr>
+                    <pic:cNvPr id="982731846" name=""/>
+                    <pic:cNvPicPr/>
+                  </pic:nvPicPr>
+                  <pic:blipFill>
+                    <a:blip r:embed="rId8"/>
+                    <a:stretch>
+                      <a:fillRect/>
+                    </a:stretch>
+                  </pic:blipFill>
+                  <pic:spPr>
+                    <a:xfrm>
+                      <a:off x="0" y="0"/>
+                      <a:ext cx="5943600" cy="3622040"/>
+                    </a:xfrm>
+                    <a:prstGeom prst="rect">
+                      <a:avLst/>
+                    </a:prstGeom>
+                  </pic:spPr>
+                </pic:pic>
+              </a:graphicData>
+            </a:graphic>
+          </wp:inline>
+        </w:drawing>
+      </w:r>
+    </w:p>
+    <w:p>
+      <w:pPr>
+        <w:numPr>
+          <w:ilvl w:val="2"/>
+          <w:numId w:val="12"/>
+        </w:numPr>
+      </w:pPr>
+      <w:proofErr w:type="spellStart"/>
+      <w:r>
+        <w:t>Finance_Group</w:t>
+      </w:r>
+      <w:proofErr w:type="spellEnd"/>
+      <w:r>
+        <w:t>:</w:t>
+      </w:r>
+    </w:p>
+    <w:p>
+      <w:r>
+        <w:rPr>
+          <w:noProof/>
+        </w:rPr>
+        <w:lastRenderedPageBreak/>
+        <w:drawing>
+          <wp:inline distT="0" distB="0" distL="0" distR="0" wp14:anchorId="24694852" wp14:editId="43A771D8">
+            <wp:extent cx="5943600" cy="2503805"/>
+            <wp:effectExtent l="0" t="0" r="0" b="0"/>
+            <wp:docPr id="503275196" name="Picture 1"/>
+            <wp:cNvGraphicFramePr>
+              <a:graphicFrameLocks xmlns:a="http://schemas.openxmlformats.org/drawingml/2006/main" noChangeAspect="1"/>
+            </wp:cNvGraphicFramePr>
+            <a:graphic xmlns:a="http://schemas.openxmlformats.org/drawingml/2006/main">
+              <a:graphicData uri="http://schemas.openxmlformats.org/drawingml/2006/picture">
+                <pic:pic xmlns:pic="http://schemas.openxmlformats.org/drawingml/2006/picture">
+                  <pic:nvPicPr>
+                    <pic:cNvPr id="503275196" name=""/>
+                    <pic:cNvPicPr/>
+                  </pic:nvPicPr>
+                  <pic:blipFill>
+                    <a:blip r:embed="rId9"/>
+                    <a:stretch>
+                      <a:fillRect/>
+                    </a:stretch>
+                  </pic:blipFill>
+                  <pic:spPr>
+                    <a:xfrm>
+                      <a:off x="0" y="0"/>
+                      <a:ext cx="5943600" cy="2503805"/>
+                    </a:xfrm>
+                    <a:prstGeom prst="rect">
+                      <a:avLst/>
+                    </a:prstGeom>
+                  </pic:spPr>
+                </pic:pic>
+              </a:graphicData>
+            </a:graphic>
+          </wp:inline>
+        </w:drawing>
+      </w:r>
+    </w:p>
+    <w:p>
+      <w:pPr>
+        <w:numPr>
+          <w:ilvl w:val="2"/>
+          <w:numId w:val="12"/>
+        </w:numPr>
+      </w:pPr>
+      <w:proofErr w:type="spellStart"/>
+      <w:r>
+        <w:t>Developer_Group</w:t>
+      </w:r>
+      <w:proofErr w:type="spellEnd"/>
+      <w:r>
+        <w:t>:</w:t>
+      </w:r>
+    </w:p>
+    <w:p>
+      <w:r>
+        <w:rPr>
+          <w:noProof/>
+        </w:rPr>
+        <w:drawing>
+          <wp:inline distT="0" distB="0" distL="0" distR="0" wp14:anchorId="6EFBA015" wp14:editId="4B9ED22F">
+            <wp:extent cx="5943600" cy="2760980"/>
+            <wp:effectExtent l="0" t="0" r="0" b="1270"/>
+            <wp:docPr id="1198293482" name="Picture 1"/>
+            <wp:cNvGraphicFramePr>
+              <a:graphicFrameLocks xmlns:a="http://schemas.openxmlformats.org/drawingml/2006/main" noChangeAspect="1"/>
+            </wp:cNvGraphicFramePr>
+            <a:graphic xmlns:a="http://schemas.openxmlformats.org/drawingml/2006/main">
+              <a:graphicData uri="http://schemas.openxmlformats.org/drawingml/2006/picture">
+                <pic:pic xmlns:pic="http://schemas.openxmlformats.org/drawingml/2006/picture">
+                  <pic:nvPicPr>
+                    <pic:cNvPr id="1198293482" name=""/>
+                    <pic:cNvPicPr/>
+                  </pic:nvPicPr>
+                  <pic:blipFill>
+                    <a:blip r:embed="rId10"/>
+                    <a:stretch>
+                      <a:fillRect/>
+                    </a:stretch>
+                  </pic:blipFill>
+                  <pic:spPr>
+                    <a:xfrm>
+                      <a:off x="0" y="0"/>
+                      <a:ext cx="5943600" cy="2760980"/>
+                    </a:xfrm>
+                    <a:prstGeom prst="rect">
+                      <a:avLst/>
+                    </a:prstGeom>
+                  </pic:spPr>
+                </pic:pic>
+              </a:graphicData>
+            </a:graphic>
+          </wp:inline>
+        </w:drawing>
+      </w:r>
+    </w:p>
+    <w:p>
+      <w:pPr>
+        <w:numPr>
+          <w:ilvl w:val="2"/>
+          <w:numId w:val="12"/>
+        </w:numPr>
+      </w:pPr>
+      <w:proofErr w:type="spellStart"/>
+      <w:r>
+        <w:t>Data_Group</w:t>
+      </w:r>
+      <w:proofErr w:type="spellEnd"/>
+      <w:r>
+        <w:t>:</w:t>
+      </w:r>
+    </w:p>
+    <w:p>
+      <w:r>
+        <w:rPr>
+          <w:noProof/>
+        </w:rPr>
+        <w:lastRenderedPageBreak/>
+        <w:drawing>
+          <wp:inline distT="0" distB="0" distL="0" distR="0" wp14:anchorId="69739AEF" wp14:editId="18B8331C">
+            <wp:extent cx="5943600" cy="2687955"/>
+            <wp:effectExtent l="0" t="0" r="0" b="0"/>
+            <wp:docPr id="1578428125" name="Picture 1"/>
+            <wp:cNvGraphicFramePr>
+              <a:graphicFrameLocks xmlns:a="http://schemas.openxmlformats.org/drawingml/2006/main" noChangeAspect="1"/>
+            </wp:cNvGraphicFramePr>
+            <a:graphic xmlns:a="http://schemas.openxmlformats.org/drawingml/2006/main">
+              <a:graphicData uri="http://schemas.openxmlformats.org/drawingml/2006/picture">
+                <pic:pic xmlns:pic="http://schemas.openxmlformats.org/drawingml/2006/picture">
+                  <pic:nvPicPr>
+                    <pic:cNvPr id="1578428125" name=""/>
+                    <pic:cNvPicPr/>
+                  </pic:nvPicPr>
+                  <pic:blipFill>
+                    <a:blip r:embed="rId11"/>
+                    <a:stretch>
+                      <a:fillRect/>
+                    </a:stretch>
+                  </pic:blipFill>
+                  <pic:spPr>
+                    <a:xfrm>
+                      <a:off x="0" y="0"/>
+                      <a:ext cx="5943600" cy="2687955"/>
+                    </a:xfrm>
+                    <a:prstGeom prst="rect">
+                      <a:avLst/>
+                    </a:prstGeom>
+                  </pic:spPr>
+                </pic:pic>
+              </a:graphicData>
+            </a:graphic>
+          </wp:inline>
+        </w:drawing>
+      </w:r>
+    </w:p>
+    <w:p/>
+    <w:p>
+      <w:r>
+        <w:rPr>
+          <w:noProof/>
+        </w:rPr>
+        <w:drawing>
+          <wp:inline distT="0" distB="0" distL="0" distR="0" wp14:anchorId="6803C614" wp14:editId="0293C640">
+            <wp:extent cx="5943600" cy="1459230"/>
+            <wp:effectExtent l="0" t="0" r="0" b="7620"/>
+            <wp:docPr id="843151705" name="Picture 1"/>
+            <wp:cNvGraphicFramePr>
+              <a:graphicFrameLocks xmlns:a="http://schemas.openxmlformats.org/drawingml/2006/main" noChangeAspect="1"/>
+            </wp:cNvGraphicFramePr>
+            <a:graphic xmlns:a="http://schemas.openxmlformats.org/drawingml/2006/main">
+              <a:graphicData uri="http://schemas.openxmlformats.org/drawingml/2006/picture">
+                <pic:pic xmlns:pic="http://schemas.openxmlformats.org/drawingml/2006/picture">
+                  <pic:nvPicPr>
+                    <pic:cNvPr id="843151705" name=""/>
+                    <pic:cNvPicPr/>
+                  </pic:nvPicPr>
+                  <pic:blipFill>
+                    <a:blip r:embed="rId12"/>
+                    <a:stretch>
+                      <a:fillRect/>
+                    </a:stretch>
+                  </pic:blipFill>
+                  <pic:spPr>
+                    <a:xfrm>
+                      <a:off x="0" y="0"/>
+                      <a:ext cx="5943600" cy="1459230"/>
+                    </a:xfrm>
+                    <a:prstGeom prst="rect">
+                      <a:avLst/>
+                    </a:prstGeom>
+                  </pic:spPr>
+                </pic:pic>
+              </a:graphicData>
+            </a:graphic>
+          </wp:inline>
+        </w:drawing>
+      </w:r>
+    </w:p>
+    <w:p>
+      <w:pPr>
+        <w:pStyle w:val="ListParagraph"/>
+        <w:numPr>
+          <w:ilvl w:val="0"/>
+          <w:numId w:val="12"/>
+        </w:numPr>
+      </w:pPr>
+      <w:r>
+        <w:t>MFA was set up for all users, with Google Authenticator being preferred by the company as they allow BYOD.</w:t>
+      </w:r>
+    </w:p>
+    <w:p>
+      <w:pPr>
+        <w:pStyle w:val="ListParagraph"/>
+        <w:numPr>
+          <w:ilvl w:val="0"/>
+          <w:numId w:val="12"/>
+        </w:numPr>
+      </w:pPr>
+      <w:r>
+        <w:t>Password policy: The following password policy is in place:</w:t>
+      </w:r>
+    </w:p>
+    <w:p>
+      <w:pPr>
+        <w:ind w:left="360"/>
+      </w:pPr>
+      <w:r>
+        <w:rPr>
+          <w:noProof/>
+        </w:rPr>
+        <w:lastRenderedPageBreak/>
+        <w:drawing>
+          <wp:inline distT="0" distB="0" distL="0" distR="0" wp14:anchorId="122BFB3F" wp14:editId="0559ECC7">
+            <wp:extent cx="5943600" cy="4249420"/>
+            <wp:effectExtent l="0" t="0" r="0" b="0"/>
+            <wp:docPr id="1528488494" name="Picture 1"/>
+            <wp:cNvGraphicFramePr>
+              <a:graphicFrameLocks xmlns:a="http://schemas.openxmlformats.org/drawingml/2006/main" noChangeAspect="1"/>
+            </wp:cNvGraphicFramePr>
+            <a:graphic xmlns:a="http://schemas.openxmlformats.org/drawingml/2006/main">
+              <a:graphicData uri="http://schemas.openxmlformats.org/drawingml/2006/picture">
+                <pic:pic xmlns:pic="http://schemas.openxmlformats.org/drawingml/2006/picture">
+                  <pic:nvPicPr>
+                    <pic:cNvPr id="1528488494" name=""/>
+                    <pic:cNvPicPr/>
+                  </pic:nvPicPr>
+                  <pic:blipFill>
+                    <a:blip r:embed="rId13"/>
+                    <a:stretch>
+                      <a:fillRect/>
+                    </a:stretch>
+                  </pic:blipFill>
+                  <pic:spPr>
+                    <a:xfrm>
+                      <a:off x="0" y="0"/>
+                      <a:ext cx="5943600" cy="4249420"/>
+                    </a:xfrm>
+                    <a:prstGeom prst="rect">
+                      <a:avLst/>
+                    </a:prstGeom>
+                  </pic:spPr>
+                </pic:pic>
+              </a:graphicData>
+            </a:graphic>
+          </wp:inline>
+        </w:drawing>
+      </w:r>
+    </w:p>
+    <w:p>
+      <w:pPr>
+        <w:pStyle w:val="ListParagraph"/>
+        <w:numPr>
+          <w:ilvl w:val="0"/>
+          <w:numId w:val="12"/>
+        </w:numPr>
+      </w:pPr>
+      <w:r>
+        <w:t>User details:</w:t>
+      </w:r>
+    </w:p>
+    <w:p>
+      <w:r>
+        <w:lastRenderedPageBreak/>
+        <w:drawing>
+          <wp:inline distT="0" distB="0" distL="0" distR="0" wp14:anchorId="789C50E1" wp14:editId="1FD7CD1D">
+            <wp:extent cx="2800741" cy="5334744"/>
+            <wp:effectExtent l="0" t="0" r="0" b="0"/>
+            <wp:docPr id="1951210665" name="Picture 1"/>
+            <wp:cNvGraphicFramePr>
+              <a:graphicFrameLocks xmlns:a="http://schemas.openxmlformats.org/drawingml/2006/main" noChangeAspect="1"/>
+            </wp:cNvGraphicFramePr>
+            <a:graphic xmlns:a="http://schemas.openxmlformats.org/drawingml/2006/main">
+              <a:graphicData uri="http://schemas.openxmlformats.org/drawingml/2006/picture">
+                <pic:pic xmlns:pic="http://schemas.openxmlformats.org/drawingml/2006/picture">
+                  <pic:nvPicPr>
+                    <pic:cNvPr id="1951210665" name=""/>
+                    <pic:cNvPicPr/>
+                  </pic:nvPicPr>
+                  <pic:blipFill>
+                    <a:blip r:embed="rId14"/>
+                    <a:stretch>
+                      <a:fillRect/>
+                    </a:stretch>
+                  </pic:blipFill>
+                  <pic:spPr>
+                    <a:xfrm>
+                      <a:off x="0" y="0"/>
+                      <a:ext cx="2800741" cy="5334744"/>
+                    </a:xfrm>
+                    <a:prstGeom prst="rect">
+                      <a:avLst/>
+                    </a:prstGeom>
+                  </pic:spPr>
+                </pic:pic>
+              </a:graphicData>
+            </a:graphic>
+          </wp:inline>
+        </w:drawing>
+      </w:r>
+    </w:p>
+    <w:p>
+      <w:r>
+        <w:lastRenderedPageBreak/>
+        <w:drawing>
+          <wp:inline distT="0" distB="0" distL="0" distR="0" wp14:anchorId="00AC6FAD" wp14:editId="7244E070">
+            <wp:extent cx="3439005" cy="4267796"/>
+            <wp:effectExtent l="0" t="0" r="9525" b="0"/>
+            <wp:docPr id="1548680518" name="Picture 1"/>
+            <wp:cNvGraphicFramePr>
+              <a:graphicFrameLocks xmlns:a="http://schemas.openxmlformats.org/drawingml/2006/main" noChangeAspect="1"/>
+            </wp:cNvGraphicFramePr>
+            <a:graphic xmlns:a="http://schemas.openxmlformats.org/drawingml/2006/main">
+              <a:graphicData uri="http://schemas.openxmlformats.org/drawingml/2006/picture">
+                <pic:pic xmlns:pic="http://schemas.openxmlformats.org/drawingml/2006/picture">
+                  <pic:nvPicPr>
+                    <pic:cNvPr id="1548680518" name=""/>
+                    <pic:cNvPicPr/>
+                  </pic:nvPicPr>
+                  <pic:blipFill>
+                    <a:blip r:embed="rId15"/>
+                    <a:stretch>
+                      <a:fillRect/>
+                    </a:stretch>
+                  </pic:blipFill>
+                  <pic:spPr>
+                    <a:xfrm>
+                      <a:off x="0" y="0"/>
+                      <a:ext cx="3439005" cy="4267796"/>
+                    </a:xfrm>
+                    <a:prstGeom prst="rect">
+                      <a:avLst/>
+                    </a:prstGeom>
+                  </pic:spPr>
+                </pic:pic>
+              </a:graphicData>
+            </a:graphic>
+          </wp:inline>
+        </w:drawing>
+      </w:r>
+      <w:r>
+        <w:lastRenderedPageBreak/>
+        <w:drawing>
+          <wp:inline distT="0" distB="0" distL="0" distR="0" wp14:anchorId="2C9D163B" wp14:editId="216A9473">
+            <wp:extent cx="3600953" cy="4667901"/>
+            <wp:effectExtent l="0" t="0" r="0" b="0"/>
+            <wp:docPr id="1614677505" name="Picture 1"/>
+            <wp:cNvGraphicFramePr>
+              <a:graphicFrameLocks xmlns:a="http://schemas.openxmlformats.org/drawingml/2006/main" noChangeAspect="1"/>
+            </wp:cNvGraphicFramePr>
+            <a:graphic xmlns:a="http://schemas.openxmlformats.org/drawingml/2006/main">
+              <a:graphicData uri="http://schemas.openxmlformats.org/drawingml/2006/picture">
+                <pic:pic xmlns:pic="http://schemas.openxmlformats.org/drawingml/2006/picture">
+                  <pic:nvPicPr>
+                    <pic:cNvPr id="1614677505" name=""/>
+                    <pic:cNvPicPr/>
+                  </pic:nvPicPr>
+                  <pic:blipFill>
+                    <a:blip r:embed="rId16"/>
+                    <a:stretch>
+                      <a:fillRect/>
+                    </a:stretch>
+                  </pic:blipFill>
+                  <pic:spPr>
+                    <a:xfrm>
+                      <a:off x="0" y="0"/>
+                      <a:ext cx="3600953" cy="4667901"/>
+                    </a:xfrm>
+                    <a:prstGeom prst="rect">
+                      <a:avLst/>
+                    </a:prstGeom>
+                  </pic:spPr>
+                </pic:pic>
+              </a:graphicData>
+            </a:graphic>
+          </wp:inline>
+        </w:drawing>
+      </w:r>
+      <w:r>
+        <w:lastRenderedPageBreak/>
+        <w:drawing>
+          <wp:inline distT="0" distB="0" distL="0" distR="0" wp14:anchorId="4B0A5F07" wp14:editId="67EC6B41">
+            <wp:extent cx="3219899" cy="4010585"/>
+            <wp:effectExtent l="0" t="0" r="0" b="9525"/>
+            <wp:docPr id="659180080" name="Picture 1"/>
+            <wp:cNvGraphicFramePr>
+              <a:graphicFrameLocks xmlns:a="http://schemas.openxmlformats.org/drawingml/2006/main" noChangeAspect="1"/>
+            </wp:cNvGraphicFramePr>
+            <a:graphic xmlns:a="http://schemas.openxmlformats.org/drawingml/2006/main">
+              <a:graphicData uri="http://schemas.openxmlformats.org/drawingml/2006/picture">
+                <pic:pic xmlns:pic="http://schemas.openxmlformats.org/drawingml/2006/picture">
+                  <pic:nvPicPr>
+                    <pic:cNvPr id="659180080" name=""/>
+                    <pic:cNvPicPr/>
+                  </pic:nvPicPr>
+                  <pic:blipFill>
+                    <a:blip r:embed="rId17"/>
+                    <a:stretch>
+                      <a:fillRect/>
+                    </a:stretch>
+                  </pic:blipFill>
+                  <pic:spPr>
+                    <a:xfrm>
+                      <a:off x="0" y="0"/>
+                      <a:ext cx="3219899" cy="4010585"/>
+                    </a:xfrm>
+                    <a:prstGeom prst="rect">
+                      <a:avLst/>
+                    </a:prstGeom>
+                  </pic:spPr>
+                </pic:pic>
+              </a:graphicData>
+            </a:graphic>
+          </wp:inline>
+        </w:drawing>
+      </w:r>
+      <w:r>
+        <w:drawing>
+          <wp:inline distT="0" distB="0" distL="0" distR="0" wp14:anchorId="3594B1D1" wp14:editId="247671B9">
+            <wp:extent cx="3448531" cy="4039164"/>
+            <wp:effectExtent l="0" t="0" r="0" b="0"/>
+            <wp:docPr id="990034460" name="Picture 1"/>
+            <wp:cNvGraphicFramePr>
+              <a:graphicFrameLocks xmlns:a="http://schemas.openxmlformats.org/drawingml/2006/main" noChangeAspect="1"/>
+            </wp:cNvGraphicFramePr>
+            <a:graphic xmlns:a="http://schemas.openxmlformats.org/drawingml/2006/main">
+              <a:graphicData uri="http://schemas.openxmlformats.org/drawingml/2006/picture">
+                <pic:pic xmlns:pic="http://schemas.openxmlformats.org/drawingml/2006/picture">
+                  <pic:nvPicPr>
+                    <pic:cNvPr id="990034460" name=""/>
+                    <pic:cNvPicPr/>
+                  </pic:nvPicPr>
+                  <pic:blipFill>
+                    <a:blip r:embed="rId18"/>
+                    <a:stretch>
+                      <a:fillRect/>
+                    </a:stretch>
+                  </pic:blipFill>
+                  <pic:spPr>
+                    <a:xfrm>
+                      <a:off x="0" y="0"/>
+                      <a:ext cx="3448531" cy="4039164"/>
+                    </a:xfrm>
+                    <a:prstGeom prst="rect">
+                      <a:avLst/>
+                    </a:prstGeom>
+                  </pic:spPr>
+                </pic:pic>
+              </a:graphicData>
+            </a:graphic>
+          </wp:inline>
+        </w:drawing>
+      </w:r>
+      <w:r>
+        <w:lastRenderedPageBreak/>
+        <w:drawing>
+          <wp:inline distT="0" distB="0" distL="0" distR="0" wp14:anchorId="0EC3A80D" wp14:editId="0312B4F2">
+            <wp:extent cx="2943636" cy="3943900"/>
+            <wp:effectExtent l="0" t="0" r="9525" b="0"/>
+            <wp:docPr id="1121455431" name="Picture 1"/>
+            <wp:cNvGraphicFramePr>
+              <a:graphicFrameLocks xmlns:a="http://schemas.openxmlformats.org/drawingml/2006/main" noChangeAspect="1"/>
+            </wp:cNvGraphicFramePr>
+            <a:graphic xmlns:a="http://schemas.openxmlformats.org/drawingml/2006/main">
+              <a:graphicData uri="http://schemas.openxmlformats.org/drawingml/2006/picture">
+                <pic:pic xmlns:pic="http://schemas.openxmlformats.org/drawingml/2006/picture">
+                  <pic:nvPicPr>
+                    <pic:cNvPr id="1121455431" name=""/>
+                    <pic:cNvPicPr/>
+                  </pic:nvPicPr>
+                  <pic:blipFill>
+                    <a:blip r:embed="rId19"/>
+                    <a:stretch>
+                      <a:fillRect/>
+                    </a:stretch>
+                  </pic:blipFill>
+                  <pic:spPr>
+                    <a:xfrm>
+                      <a:off x="0" y="0"/>
+                      <a:ext cx="2943636" cy="3943900"/>
+                    </a:xfrm>
+                    <a:prstGeom prst="rect">
+                      <a:avLst/>
+                    </a:prstGeom>
+                  </pic:spPr>
+                </pic:pic>
+              </a:graphicData>
+            </a:graphic>
+          </wp:inline>
+        </w:drawing>
+      </w:r>
+    </w:p>
+    <w:p>
+      <w:pPr>
+        <w:ind w:left="360"/>
+      </w:pPr>
     </w:p>
     <w:p>
       <w:pPr>
@@ -994,7 +2301,7 @@
         <w:ind w:left="1440" w:hanging="360"/>
       </w:pPr>
     </w:lvl>
-    <w:lvl w:ilvl="2" w:tentative="1">
+    <w:lvl w:ilvl="2">
       <w:start w:val="1"/>
       <w:numFmt w:val="decimal"/>
       <w:lvlText w:val="%3."/>
@@ -1006,7 +2313,7 @@
         <w:ind w:left="2160" w:hanging="360"/>
       </w:pPr>
     </w:lvl>
-    <w:lvl w:ilvl="3" w:tentative="1">
+    <w:lvl w:ilvl="3">
       <w:start w:val="1"/>
       <w:numFmt w:val="decimal"/>
       <w:lvlText w:val="%4."/>
@@ -1378,6 +2685,155 @@
     </w:lvl>
   </w:abstractNum>
   <w:abstractNum w:abstractNumId="4" w15:restartNumberingAfterBreak="0">
+    <w:nsid w:val="2C2256D2"/>
+    <w:multiLevelType w:val="multilevel"/>
+    <w:tmpl w:val="E45E92A8"/>
+    <w:lvl w:ilvl="0">
+      <w:start w:val="1"/>
+      <w:numFmt w:val="bullet"/>
+      <w:lvlText w:val=""/>
+      <w:lvlJc w:val="left"/>
+      <w:pPr>
+        <w:tabs>
+          <w:tab w:val="num" w:pos="720"/>
+        </w:tabs>
+        <w:ind w:left="720" w:hanging="360"/>
+      </w:pPr>
+      <w:rPr>
+        <w:rFonts w:ascii="Symbol" w:hAnsi="Symbol" w:hint="default"/>
+        <w:sz w:val="20"/>
+      </w:rPr>
+    </w:lvl>
+    <w:lvl w:ilvl="1" w:tentative="1">
+      <w:start w:val="1"/>
+      <w:numFmt w:val="bullet"/>
+      <w:lvlText w:val="o"/>
+      <w:lvlJc w:val="left"/>
+      <w:pPr>
+        <w:tabs>
+          <w:tab w:val="num" w:pos="1440"/>
+        </w:tabs>
+        <w:ind w:left="1440" w:hanging="360"/>
+      </w:pPr>
+      <w:rPr>
+        <w:rFonts w:ascii="Courier New" w:hAnsi="Courier New" w:hint="default"/>
+        <w:sz w:val="20"/>
+      </w:rPr>
+    </w:lvl>
+    <w:lvl w:ilvl="2" w:tentative="1">
+      <w:start w:val="1"/>
+      <w:numFmt w:val="bullet"/>
+      <w:lvlText w:val=""/>
+      <w:lvlJc w:val="left"/>
+      <w:pPr>
+        <w:tabs>
+          <w:tab w:val="num" w:pos="2160"/>
+        </w:tabs>
+        <w:ind w:left="2160" w:hanging="360"/>
+      </w:pPr>
+      <w:rPr>
+        <w:rFonts w:ascii="Wingdings" w:hAnsi="Wingdings" w:hint="default"/>
+        <w:sz w:val="20"/>
+      </w:rPr>
+    </w:lvl>
+    <w:lvl w:ilvl="3" w:tentative="1">
+      <w:start w:val="1"/>
+      <w:numFmt w:val="bullet"/>
+      <w:lvlText w:val=""/>
+      <w:lvlJc w:val="left"/>
+      <w:pPr>
+        <w:tabs>
+          <w:tab w:val="num" w:pos="2880"/>
+        </w:tabs>
+        <w:ind w:left="2880" w:hanging="360"/>
+      </w:pPr>
+      <w:rPr>
+        <w:rFonts w:ascii="Wingdings" w:hAnsi="Wingdings" w:hint="default"/>
+        <w:sz w:val="20"/>
+      </w:rPr>
+    </w:lvl>
+    <w:lvl w:ilvl="4" w:tentative="1">
+      <w:start w:val="1"/>
+      <w:numFmt w:val="bullet"/>
+      <w:lvlText w:val=""/>
+      <w:lvlJc w:val="left"/>
+      <w:pPr>
+        <w:tabs>
+          <w:tab w:val="num" w:pos="3600"/>
+        </w:tabs>
+        <w:ind w:left="3600" w:hanging="360"/>
+      </w:pPr>
+      <w:rPr>
+        <w:rFonts w:ascii="Wingdings" w:hAnsi="Wingdings" w:hint="default"/>
+        <w:sz w:val="20"/>
+      </w:rPr>
+    </w:lvl>
+    <w:lvl w:ilvl="5" w:tentative="1">
+      <w:start w:val="1"/>
+      <w:numFmt w:val="bullet"/>
+      <w:lvlText w:val=""/>
+      <w:lvlJc w:val="left"/>
+      <w:pPr>
+        <w:tabs>
+          <w:tab w:val="num" w:pos="4320"/>
+        </w:tabs>
+        <w:ind w:left="4320" w:hanging="360"/>
+      </w:pPr>
+      <w:rPr>
+        <w:rFonts w:ascii="Wingdings" w:hAnsi="Wingdings" w:hint="default"/>
+        <w:sz w:val="20"/>
+      </w:rPr>
+    </w:lvl>
+    <w:lvl w:ilvl="6" w:tentative="1">
+      <w:start w:val="1"/>
+      <w:numFmt w:val="bullet"/>
+      <w:lvlText w:val=""/>
+      <w:lvlJc w:val="left"/>
+      <w:pPr>
+        <w:tabs>
+          <w:tab w:val="num" w:pos="5040"/>
+        </w:tabs>
+        <w:ind w:left="5040" w:hanging="360"/>
+      </w:pPr>
+      <w:rPr>
+        <w:rFonts w:ascii="Wingdings" w:hAnsi="Wingdings" w:hint="default"/>
+        <w:sz w:val="20"/>
+      </w:rPr>
+    </w:lvl>
+    <w:lvl w:ilvl="7" w:tentative="1">
+      <w:start w:val="1"/>
+      <w:numFmt w:val="bullet"/>
+      <w:lvlText w:val=""/>
+      <w:lvlJc w:val="left"/>
+      <w:pPr>
+        <w:tabs>
+          <w:tab w:val="num" w:pos="5760"/>
+        </w:tabs>
+        <w:ind w:left="5760" w:hanging="360"/>
+      </w:pPr>
+      <w:rPr>
+        <w:rFonts w:ascii="Wingdings" w:hAnsi="Wingdings" w:hint="default"/>
+        <w:sz w:val="20"/>
+      </w:rPr>
+    </w:lvl>
+    <w:lvl w:ilvl="8" w:tentative="1">
+      <w:start w:val="1"/>
+      <w:numFmt w:val="bullet"/>
+      <w:lvlText w:val=""/>
+      <w:lvlJc w:val="left"/>
+      <w:pPr>
+        <w:tabs>
+          <w:tab w:val="num" w:pos="6480"/>
+        </w:tabs>
+        <w:ind w:left="6480" w:hanging="360"/>
+      </w:pPr>
+      <w:rPr>
+        <w:rFonts w:ascii="Wingdings" w:hAnsi="Wingdings" w:hint="default"/>
+        <w:sz w:val="20"/>
+      </w:rPr>
+    </w:lvl>
+  </w:abstractNum>
+  <w:abstractNum w:abstractNumId="5" w15:restartNumberingAfterBreak="0">
     <w:nsid w:val="2DFE1407"/>
     <w:multiLevelType w:val="multilevel"/>
     <w:tmpl w:val="1D7093C8"/>
@@ -1526,7 +2982,7 @@
       </w:rPr>
     </w:lvl>
   </w:abstractNum>
-  <w:abstractNum w:abstractNumId="5" w15:restartNumberingAfterBreak="0">
+  <w:abstractNum w:abstractNumId="6" w15:restartNumberingAfterBreak="0">
     <w:nsid w:val="303A572E"/>
     <w:multiLevelType w:val="multilevel"/>
     <w:tmpl w:val="94946B5E"/>
@@ -1675,7 +3131,7 @@
       </w:rPr>
     </w:lvl>
   </w:abstractNum>
-  <w:abstractNum w:abstractNumId="6" w15:restartNumberingAfterBreak="0">
+  <w:abstractNum w:abstractNumId="7" w15:restartNumberingAfterBreak="0">
     <w:nsid w:val="30BD003A"/>
     <w:multiLevelType w:val="multilevel"/>
     <w:tmpl w:val="9AD0C972"/>
@@ -1824,7 +3280,7 @@
       </w:rPr>
     </w:lvl>
   </w:abstractNum>
-  <w:abstractNum w:abstractNumId="7" w15:restartNumberingAfterBreak="0">
+  <w:abstractNum w:abstractNumId="8" w15:restartNumberingAfterBreak="0">
     <w:nsid w:val="346553E6"/>
     <w:multiLevelType w:val="multilevel"/>
     <w:tmpl w:val="C9BCB500"/>
@@ -1973,7 +3429,7 @@
       </w:rPr>
     </w:lvl>
   </w:abstractNum>
-  <w:abstractNum w:abstractNumId="8" w15:restartNumberingAfterBreak="0">
+  <w:abstractNum w:abstractNumId="9" w15:restartNumberingAfterBreak="0">
     <w:nsid w:val="369A7F04"/>
     <w:multiLevelType w:val="multilevel"/>
     <w:tmpl w:val="26F4AB56"/>
@@ -2122,7 +3578,93 @@
       </w:rPr>
     </w:lvl>
   </w:abstractNum>
-  <w:abstractNum w:abstractNumId="9" w15:restartNumberingAfterBreak="0">
+  <w:abstractNum w:abstractNumId="10" w15:restartNumberingAfterBreak="0">
+    <w:nsid w:val="4B220A0D"/>
+    <w:multiLevelType w:val="hybridMultilevel"/>
+    <w:tmpl w:val="6AE2E74C"/>
+    <w:lvl w:ilvl="0" w:tplc="0409000F">
+      <w:start w:val="1"/>
+      <w:numFmt w:val="decimal"/>
+      <w:lvlText w:val="%1."/>
+      <w:lvlJc w:val="left"/>
+      <w:pPr>
+        <w:ind w:left="360" w:hanging="360"/>
+      </w:pPr>
+    </w:lvl>
+    <w:lvl w:ilvl="1" w:tplc="04090019" w:tentative="1">
+      <w:start w:val="1"/>
+      <w:numFmt w:val="lowerLetter"/>
+      <w:lvlText w:val="%2."/>
+      <w:lvlJc w:val="left"/>
+      <w:pPr>
+        <w:ind w:left="1080" w:hanging="360"/>
+      </w:pPr>
+    </w:lvl>
+    <w:lvl w:ilvl="2" w:tplc="0409001B" w:tentative="1">
+      <w:start w:val="1"/>
+      <w:numFmt w:val="lowerRoman"/>
+      <w:lvlText w:val="%3."/>
+      <w:lvlJc w:val="right"/>
+      <w:pPr>
+        <w:ind w:left="1800" w:hanging="180"/>
+      </w:pPr>
+    </w:lvl>
+    <w:lvl w:ilvl="3" w:tplc="0409000F" w:tentative="1">
+      <w:start w:val="1"/>
+      <w:numFmt w:val="decimal"/>
+      <w:lvlText w:val="%4."/>
+      <w:lvlJc w:val="left"/>
+      <w:pPr>
+        <w:ind w:left="2520" w:hanging="360"/>
+      </w:pPr>
+    </w:lvl>
+    <w:lvl w:ilvl="4" w:tplc="04090019" w:tentative="1">
+      <w:start w:val="1"/>
+      <w:numFmt w:val="lowerLetter"/>
+      <w:lvlText w:val="%5."/>
+      <w:lvlJc w:val="left"/>
+      <w:pPr>
+        <w:ind w:left="3240" w:hanging="360"/>
+      </w:pPr>
+    </w:lvl>
+    <w:lvl w:ilvl="5" w:tplc="0409001B" w:tentative="1">
+      <w:start w:val="1"/>
+      <w:numFmt w:val="lowerRoman"/>
+      <w:lvlText w:val="%6."/>
+      <w:lvlJc w:val="right"/>
+      <w:pPr>
+        <w:ind w:left="3960" w:hanging="180"/>
+      </w:pPr>
+    </w:lvl>
+    <w:lvl w:ilvl="6" w:tplc="0409000F" w:tentative="1">
+      <w:start w:val="1"/>
+      <w:numFmt w:val="decimal"/>
+      <w:lvlText w:val="%7."/>
+      <w:lvlJc w:val="left"/>
+      <w:pPr>
+        <w:ind w:left="4680" w:hanging="360"/>
+      </w:pPr>
+    </w:lvl>
+    <w:lvl w:ilvl="7" w:tplc="04090019" w:tentative="1">
+      <w:start w:val="1"/>
+      <w:numFmt w:val="lowerLetter"/>
+      <w:lvlText w:val="%8."/>
+      <w:lvlJc w:val="left"/>
+      <w:pPr>
+        <w:ind w:left="5400" w:hanging="360"/>
+      </w:pPr>
+    </w:lvl>
+    <w:lvl w:ilvl="8" w:tplc="0409001B" w:tentative="1">
+      <w:start w:val="1"/>
+      <w:numFmt w:val="lowerRoman"/>
+      <w:lvlText w:val="%9."/>
+      <w:lvlJc w:val="right"/>
+      <w:pPr>
+        <w:ind w:left="6120" w:hanging="180"/>
+      </w:pPr>
+    </w:lvl>
+  </w:abstractNum>
+  <w:abstractNum w:abstractNumId="11" w15:restartNumberingAfterBreak="0">
     <w:nsid w:val="4B5C4103"/>
     <w:multiLevelType w:val="multilevel"/>
     <w:tmpl w:val="B5C24BD0"/>
@@ -2271,7 +3813,7 @@
       </w:rPr>
     </w:lvl>
   </w:abstractNum>
-  <w:abstractNum w:abstractNumId="10" w15:restartNumberingAfterBreak="0">
+  <w:abstractNum w:abstractNumId="12" w15:restartNumberingAfterBreak="0">
     <w:nsid w:val="59055260"/>
     <w:multiLevelType w:val="multilevel"/>
     <w:tmpl w:val="DD6AB230"/>
@@ -2420,7 +3962,7 @@
       </w:rPr>
     </w:lvl>
   </w:abstractNum>
-  <w:abstractNum w:abstractNumId="11" w15:restartNumberingAfterBreak="0">
+  <w:abstractNum w:abstractNumId="13" w15:restartNumberingAfterBreak="0">
     <w:nsid w:val="6A0464C6"/>
     <w:multiLevelType w:val="multilevel"/>
     <w:tmpl w:val="98BCC886"/>
@@ -2569,7 +4111,7 @@
       </w:rPr>
     </w:lvl>
   </w:abstractNum>
-  <w:abstractNum w:abstractNumId="12" w15:restartNumberingAfterBreak="0">
+  <w:abstractNum w:abstractNumId="14" w15:restartNumberingAfterBreak="0">
     <w:nsid w:val="799D3C9F"/>
     <w:multiLevelType w:val="multilevel"/>
     <w:tmpl w:val="C2B63C70"/>
@@ -2722,40 +4264,46 @@
     <w:abstractNumId w:val="3"/>
   </w:num>
   <w:num w:numId="2" w16cid:durableId="897131695">
-    <w:abstractNumId w:val="11"/>
+    <w:abstractNumId w:val="13"/>
   </w:num>
   <w:num w:numId="3" w16cid:durableId="1402866818">
     <w:abstractNumId w:val="0"/>
   </w:num>
   <w:num w:numId="4" w16cid:durableId="2111243451">
+    <w:abstractNumId w:val="14"/>
+  </w:num>
+  <w:num w:numId="5" w16cid:durableId="388041709">
+    <w:abstractNumId w:val="8"/>
+  </w:num>
+  <w:num w:numId="6" w16cid:durableId="1269771958">
+    <w:abstractNumId w:val="6"/>
+  </w:num>
+  <w:num w:numId="7" w16cid:durableId="1863199708">
+    <w:abstractNumId w:val="5"/>
+  </w:num>
+  <w:num w:numId="8" w16cid:durableId="706176354">
     <w:abstractNumId w:val="12"/>
   </w:num>
-  <w:num w:numId="5" w16cid:durableId="388041709">
+  <w:num w:numId="9" w16cid:durableId="1390228510">
     <w:abstractNumId w:val="7"/>
-  </w:num>
-  <w:num w:numId="6" w16cid:durableId="1269771958">
-    <w:abstractNumId w:val="5"/>
-  </w:num>
-  <w:num w:numId="7" w16cid:durableId="1863199708">
-    <w:abstractNumId w:val="4"/>
-  </w:num>
-  <w:num w:numId="8" w16cid:durableId="706176354">
-    <w:abstractNumId w:val="10"/>
-  </w:num>
-  <w:num w:numId="9" w16cid:durableId="1390228510">
-    <w:abstractNumId w:val="6"/>
   </w:num>
   <w:num w:numId="10" w16cid:durableId="785275424">
     <w:abstractNumId w:val="2"/>
   </w:num>
   <w:num w:numId="11" w16cid:durableId="2141877746">
-    <w:abstractNumId w:val="9"/>
+    <w:abstractNumId w:val="11"/>
   </w:num>
   <w:num w:numId="12" w16cid:durableId="1228228600">
     <w:abstractNumId w:val="1"/>
   </w:num>
   <w:num w:numId="13" w16cid:durableId="1292132551">
-    <w:abstractNumId w:val="8"/>
+    <w:abstractNumId w:val="9"/>
+  </w:num>
+  <w:num w:numId="14" w16cid:durableId="1797479219">
+    <w:abstractNumId w:val="4"/>
+  </w:num>
+  <w:num w:numId="15" w16cid:durableId="1205944062">
+    <w:abstractNumId w:val="10"/>
   </w:num>
 </w:numbering>
 </file>
@@ -3363,6 +4911,7 @@
   <w:style w:type="character" w:default="1" w:styleId="DefaultParagraphFont">
     <w:name w:val="Default Paragraph Font"/>
     <w:uiPriority w:val="1"/>
+    <w:semiHidden/>
     <w:unhideWhenUsed/>
   </w:style>
   <w:style w:type="table" w:default="1" w:styleId="TableNormal">

</xml_diff>